<commit_message>
docs: inject confirmed academic details and correct team responsibilities across all 8 phases; regenerate PDFs; sync root report; update README and checklist
</commit_message>
<xml_diff>
--- a/AI_FitTrack_Final_Documentation.docx
+++ b/AI_FitTrack_Final_Documentation.docx
@@ -70,7 +70,6 @@
         <w:tc>
           <w:tcPr>
             <w:tcW w:type="dxa" w:w="2232"/>
-            <w:shd w:fill="16324F"/>
             <w:vAlign w:val="center"/>
             <w:tcMar>
               <w:top w:w="100" w:type="dxa"/>
@@ -78,11 +77,13 @@
               <w:bottom w:w="100" w:type="dxa"/>
               <w:end w:w="110" w:type="dxa"/>
             </w:tcMar>
+            <w:shd w:fill="16324F"/>
           </w:tcPr>
           <w:p>
             <w:pPr>
               <w:jc w:val="center"/>
             </w:pPr>
+            <w:r/>
             <w:r>
               <w:rPr>
                 <w:rFonts w:ascii="Aptos" w:hAnsi="Aptos"/>
@@ -97,7 +98,6 @@
         <w:tc>
           <w:tcPr>
             <w:tcW w:type="dxa" w:w="7560"/>
-            <w:shd w:fill="16324F"/>
             <w:vAlign w:val="center"/>
             <w:tcMar>
               <w:top w:w="100" w:type="dxa"/>
@@ -105,11 +105,13 @@
               <w:bottom w:w="100" w:type="dxa"/>
               <w:end w:w="110" w:type="dxa"/>
             </w:tcMar>
+            <w:shd w:fill="16324F"/>
           </w:tcPr>
           <w:p>
             <w:pPr>
               <w:jc w:val="center"/>
             </w:pPr>
+            <w:r/>
             <w:r>
               <w:rPr>
                 <w:rFonts w:ascii="Aptos" w:hAnsi="Aptos"/>
@@ -141,9 +143,11 @@
             <w:pPr>
               <w:jc w:val="left"/>
             </w:pPr>
+            <w:r/>
             <w:r>
               <w:rPr>
                 <w:rFonts w:ascii="Aptos" w:hAnsi="Aptos"/>
+                <w:b w:val="0"/>
                 <w:color w:val="000000"/>
                 <w:sz w:val="19"/>
               </w:rPr>
@@ -166,9 +170,11 @@
             <w:pPr>
               <w:jc w:val="left"/>
             </w:pPr>
+            <w:r/>
             <w:r>
               <w:rPr>
                 <w:rFonts w:ascii="Aptos" w:hAnsi="Aptos"/>
+                <w:b w:val="0"/>
                 <w:color w:val="000000"/>
                 <w:sz w:val="19"/>
               </w:rPr>
@@ -184,7 +190,6 @@
         <w:tc>
           <w:tcPr>
             <w:tcW w:type="dxa" w:w="2232"/>
-            <w:shd w:fill="F8FAFC"/>
             <w:vAlign w:val="center"/>
             <w:tcMar>
               <w:top w:w="100" w:type="dxa"/>
@@ -192,14 +197,17 @@
               <w:bottom w:w="100" w:type="dxa"/>
               <w:end w:w="110" w:type="dxa"/>
             </w:tcMar>
+            <w:shd w:fill="F8FAFC"/>
           </w:tcPr>
           <w:p>
             <w:pPr>
               <w:jc w:val="left"/>
             </w:pPr>
+            <w:r/>
             <w:r>
               <w:rPr>
                 <w:rFonts w:ascii="Aptos" w:hAnsi="Aptos"/>
+                <w:b w:val="0"/>
                 <w:color w:val="000000"/>
                 <w:sz w:val="19"/>
               </w:rPr>
@@ -210,7 +218,6 @@
         <w:tc>
           <w:tcPr>
             <w:tcW w:type="dxa" w:w="7560"/>
-            <w:shd w:fill="F8FAFC"/>
             <w:vAlign w:val="center"/>
             <w:tcMar>
               <w:top w:w="100" w:type="dxa"/>
@@ -218,14 +225,17 @@
               <w:bottom w:w="100" w:type="dxa"/>
               <w:end w:w="110" w:type="dxa"/>
             </w:tcMar>
+            <w:shd w:fill="F8FAFC"/>
           </w:tcPr>
           <w:p>
             <w:pPr>
               <w:jc w:val="left"/>
             </w:pPr>
+            <w:r/>
             <w:r>
               <w:rPr>
                 <w:rFonts w:ascii="Aptos" w:hAnsi="Aptos"/>
+                <w:b w:val="0"/>
                 <w:color w:val="000000"/>
                 <w:sz w:val="19"/>
               </w:rPr>
@@ -253,13 +263,15 @@
             <w:pPr>
               <w:jc w:val="left"/>
             </w:pPr>
+            <w:r/>
             <w:r>
               <w:rPr>
                 <w:rFonts w:ascii="Aptos" w:hAnsi="Aptos"/>
+                <w:b w:val="0"/>
                 <w:color w:val="000000"/>
                 <w:sz w:val="19"/>
               </w:rPr>
-              <w:t>Project scope</w:t>
+              <w:t>Team ID</w:t>
             </w:r>
           </w:p>
         </w:tc>
@@ -278,13 +290,15 @@
             <w:pPr>
               <w:jc w:val="left"/>
             </w:pPr>
+            <w:r/>
             <w:r>
               <w:rPr>
                 <w:rFonts w:ascii="Aptos" w:hAnsi="Aptos"/>
+                <w:b w:val="0"/>
                 <w:color w:val="000000"/>
                 <w:sz w:val="19"/>
               </w:rPr>
-              <w:t>Backend-only REST API</w:t>
+              <w:t>SWTID-2026-8100</w:t>
             </w:r>
           </w:p>
         </w:tc>
@@ -296,7 +310,6 @@
         <w:tc>
           <w:tcPr>
             <w:tcW w:type="dxa" w:w="2232"/>
-            <w:shd w:fill="F8FAFC"/>
             <w:vAlign w:val="center"/>
             <w:tcMar>
               <w:top w:w="100" w:type="dxa"/>
@@ -304,25 +317,27 @@
               <w:bottom w:w="100" w:type="dxa"/>
               <w:end w:w="110" w:type="dxa"/>
             </w:tcMar>
+            <w:shd w:fill="F8FAFC"/>
           </w:tcPr>
           <w:p>
             <w:pPr>
               <w:jc w:val="left"/>
             </w:pPr>
+            <w:r/>
             <w:r>
               <w:rPr>
                 <w:rFonts w:ascii="Aptos" w:hAnsi="Aptos"/>
+                <w:b w:val="0"/>
                 <w:color w:val="000000"/>
                 <w:sz w:val="19"/>
               </w:rPr>
-              <w:t>Technology</w:t>
+              <w:t>Team size</w:t>
             </w:r>
           </w:p>
         </w:tc>
         <w:tc>
           <w:tcPr>
             <w:tcW w:type="dxa" w:w="7560"/>
-            <w:shd w:fill="F8FAFC"/>
             <w:vAlign w:val="center"/>
             <w:tcMar>
               <w:top w:w="100" w:type="dxa"/>
@@ -330,18 +345,21 @@
               <w:bottom w:w="100" w:type="dxa"/>
               <w:end w:w="110" w:type="dxa"/>
             </w:tcMar>
+            <w:shd w:fill="F8FAFC"/>
           </w:tcPr>
           <w:p>
             <w:pPr>
               <w:jc w:val="left"/>
             </w:pPr>
+            <w:r/>
             <w:r>
               <w:rPr>
                 <w:rFonts w:ascii="Aptos" w:hAnsi="Aptos"/>
+                <w:b w:val="0"/>
                 <w:color w:val="000000"/>
                 <w:sz w:val="19"/>
               </w:rPr>
-              <w:t>Node.js, Express.js, MongoDB, Mongoose, JWT and Google Gemini AI</w:t>
+              <w:t>4</w:t>
             </w:r>
           </w:p>
         </w:tc>
@@ -365,13 +383,15 @@
             <w:pPr>
               <w:jc w:val="left"/>
             </w:pPr>
+            <w:r/>
             <w:r>
               <w:rPr>
                 <w:rFonts w:ascii="Aptos" w:hAnsi="Aptos"/>
+                <w:b w:val="0"/>
                 <w:color w:val="000000"/>
                 <w:sz w:val="19"/>
               </w:rPr>
-              <w:t>Source baseline</w:t>
+              <w:t>College</w:t>
             </w:r>
           </w:p>
         </w:tc>
@@ -390,9 +410,551 @@
             <w:pPr>
               <w:jc w:val="left"/>
             </w:pPr>
+            <w:r/>
             <w:r>
               <w:rPr>
                 <w:rFonts w:ascii="Aptos" w:hAnsi="Aptos"/>
+                <w:b w:val="0"/>
+                <w:color w:val="000000"/>
+                <w:sz w:val="19"/>
+              </w:rPr>
+              <w:t>DRBCCC Hindu College</w:t>
+            </w:r>
+          </w:p>
+        </w:tc>
+      </w:tr>
+      <w:tr>
+        <w:trPr>
+          <w:cantSplit/>
+        </w:trPr>
+        <w:tc>
+          <w:tcPr>
+            <w:tcW w:type="dxa" w:w="2232"/>
+            <w:vAlign w:val="center"/>
+            <w:tcMar>
+              <w:top w:w="100" w:type="dxa"/>
+              <w:start w:w="110" w:type="dxa"/>
+              <w:bottom w:w="100" w:type="dxa"/>
+              <w:end w:w="110" w:type="dxa"/>
+            </w:tcMar>
+            <w:shd w:fill="F8FAFC"/>
+          </w:tcPr>
+          <w:p>
+            <w:pPr>
+              <w:jc w:val="left"/>
+            </w:pPr>
+            <w:r/>
+            <w:r>
+              <w:rPr>
+                <w:rFonts w:ascii="Aptos" w:hAnsi="Aptos"/>
+                <w:b w:val="0"/>
+                <w:color w:val="000000"/>
+                <w:sz w:val="19"/>
+              </w:rPr>
+              <w:t>Department</w:t>
+            </w:r>
+          </w:p>
+        </w:tc>
+        <w:tc>
+          <w:tcPr>
+            <w:tcW w:type="dxa" w:w="7560"/>
+            <w:vAlign w:val="center"/>
+            <w:tcMar>
+              <w:top w:w="100" w:type="dxa"/>
+              <w:start w:w="110" w:type="dxa"/>
+              <w:bottom w:w="100" w:type="dxa"/>
+              <w:end w:w="110" w:type="dxa"/>
+            </w:tcMar>
+            <w:shd w:fill="F8FAFC"/>
+          </w:tcPr>
+          <w:p>
+            <w:pPr>
+              <w:jc w:val="left"/>
+            </w:pPr>
+            <w:r/>
+            <w:r>
+              <w:rPr>
+                <w:rFonts w:ascii="Aptos" w:hAnsi="Aptos"/>
+                <w:b w:val="0"/>
+                <w:color w:val="000000"/>
+                <w:sz w:val="19"/>
+              </w:rPr>
+              <w:t>B.Sc. Computer Science with Artificial Intelligence</w:t>
+            </w:r>
+          </w:p>
+        </w:tc>
+      </w:tr>
+      <w:tr>
+        <w:trPr>
+          <w:cantSplit/>
+        </w:trPr>
+        <w:tc>
+          <w:tcPr>
+            <w:tcW w:type="dxa" w:w="2232"/>
+            <w:vAlign w:val="center"/>
+            <w:tcMar>
+              <w:top w:w="100" w:type="dxa"/>
+              <w:start w:w="110" w:type="dxa"/>
+              <w:bottom w:w="100" w:type="dxa"/>
+              <w:end w:w="110" w:type="dxa"/>
+            </w:tcMar>
+          </w:tcPr>
+          <w:p>
+            <w:pPr>
+              <w:jc w:val="left"/>
+            </w:pPr>
+            <w:r/>
+            <w:r>
+              <w:rPr>
+                <w:rFonts w:ascii="Aptos" w:hAnsi="Aptos"/>
+                <w:b w:val="0"/>
+                <w:color w:val="000000"/>
+                <w:sz w:val="19"/>
+              </w:rPr>
+              <w:t>Academic Year</w:t>
+            </w:r>
+          </w:p>
+        </w:tc>
+        <w:tc>
+          <w:tcPr>
+            <w:tcW w:type="dxa" w:w="7560"/>
+            <w:vAlign w:val="center"/>
+            <w:tcMar>
+              <w:top w:w="100" w:type="dxa"/>
+              <w:start w:w="110" w:type="dxa"/>
+              <w:bottom w:w="100" w:type="dxa"/>
+              <w:end w:w="110" w:type="dxa"/>
+            </w:tcMar>
+          </w:tcPr>
+          <w:p>
+            <w:pPr>
+              <w:jc w:val="left"/>
+            </w:pPr>
+            <w:r/>
+            <w:r>
+              <w:rPr>
+                <w:rFonts w:ascii="Aptos" w:hAnsi="Aptos"/>
+                <w:b w:val="0"/>
+                <w:color w:val="000000"/>
+                <w:sz w:val="19"/>
+              </w:rPr>
+              <w:t>2024–2027</w:t>
+            </w:r>
+          </w:p>
+        </w:tc>
+      </w:tr>
+      <w:tr>
+        <w:trPr>
+          <w:cantSplit/>
+        </w:trPr>
+        <w:tc>
+          <w:tcPr>
+            <w:tcW w:type="dxa" w:w="2232"/>
+            <w:vAlign w:val="center"/>
+            <w:tcMar>
+              <w:top w:w="100" w:type="dxa"/>
+              <w:start w:w="110" w:type="dxa"/>
+              <w:bottom w:w="100" w:type="dxa"/>
+              <w:end w:w="110" w:type="dxa"/>
+            </w:tcMar>
+            <w:shd w:fill="F8FAFC"/>
+          </w:tcPr>
+          <w:p>
+            <w:pPr>
+              <w:jc w:val="left"/>
+            </w:pPr>
+            <w:r/>
+            <w:r>
+              <w:rPr>
+                <w:rFonts w:ascii="Aptos" w:hAnsi="Aptos"/>
+                <w:b w:val="0"/>
+                <w:color w:val="000000"/>
+                <w:sz w:val="19"/>
+              </w:rPr>
+              <w:t>Faculty Guide</w:t>
+            </w:r>
+          </w:p>
+        </w:tc>
+        <w:tc>
+          <w:tcPr>
+            <w:tcW w:type="dxa" w:w="7560"/>
+            <w:vAlign w:val="center"/>
+            <w:tcMar>
+              <w:top w:w="100" w:type="dxa"/>
+              <w:start w:w="110" w:type="dxa"/>
+              <w:bottom w:w="100" w:type="dxa"/>
+              <w:end w:w="110" w:type="dxa"/>
+            </w:tcMar>
+            <w:shd w:fill="F8FAFC"/>
+          </w:tcPr>
+          <w:p>
+            <w:pPr>
+              <w:jc w:val="left"/>
+            </w:pPr>
+            <w:r/>
+            <w:r>
+              <w:rPr>
+                <w:rFonts w:ascii="Aptos" w:hAnsi="Aptos"/>
+                <w:b w:val="0"/>
+                <w:color w:val="000000"/>
+                <w:sz w:val="19"/>
+              </w:rPr>
+              <w:t>Prof. D Saraswathy</w:t>
+            </w:r>
+          </w:p>
+        </w:tc>
+      </w:tr>
+      <w:tr>
+        <w:trPr>
+          <w:cantSplit/>
+        </w:trPr>
+        <w:tc>
+          <w:tcPr>
+            <w:tcW w:type="dxa" w:w="2232"/>
+            <w:vAlign w:val="center"/>
+            <w:tcMar>
+              <w:top w:w="100" w:type="dxa"/>
+              <w:start w:w="110" w:type="dxa"/>
+              <w:bottom w:w="100" w:type="dxa"/>
+              <w:end w:w="110" w:type="dxa"/>
+            </w:tcMar>
+          </w:tcPr>
+          <w:p>
+            <w:pPr>
+              <w:jc w:val="left"/>
+            </w:pPr>
+            <w:r/>
+            <w:r>
+              <w:rPr>
+                <w:rFonts w:ascii="Aptos" w:hAnsi="Aptos"/>
+                <w:b w:val="0"/>
+                <w:color w:val="000000"/>
+                <w:sz w:val="19"/>
+              </w:rPr>
+              <w:t>Submission Date</w:t>
+            </w:r>
+          </w:p>
+        </w:tc>
+        <w:tc>
+          <w:tcPr>
+            <w:tcW w:type="dxa" w:w="7560"/>
+            <w:vAlign w:val="center"/>
+            <w:tcMar>
+              <w:top w:w="100" w:type="dxa"/>
+              <w:start w:w="110" w:type="dxa"/>
+              <w:bottom w:w="100" w:type="dxa"/>
+              <w:end w:w="110" w:type="dxa"/>
+            </w:tcMar>
+          </w:tcPr>
+          <w:p>
+            <w:pPr>
+              <w:jc w:val="left"/>
+            </w:pPr>
+            <w:r/>
+            <w:r>
+              <w:rPr>
+                <w:rFonts w:ascii="Aptos" w:hAnsi="Aptos"/>
+                <w:b w:val="0"/>
+                <w:color w:val="000000"/>
+                <w:sz w:val="19"/>
+              </w:rPr>
+            </w:r>
+          </w:p>
+        </w:tc>
+      </w:tr>
+      <w:tr>
+        <w:trPr>
+          <w:cantSplit/>
+        </w:trPr>
+        <w:tc>
+          <w:tcPr>
+            <w:tcW w:type="dxa" w:w="2232"/>
+            <w:vAlign w:val="center"/>
+            <w:tcMar>
+              <w:top w:w="100" w:type="dxa"/>
+              <w:start w:w="110" w:type="dxa"/>
+              <w:bottom w:w="100" w:type="dxa"/>
+              <w:end w:w="110" w:type="dxa"/>
+            </w:tcMar>
+            <w:shd w:fill="F8FAFC"/>
+          </w:tcPr>
+          <w:p>
+            <w:pPr>
+              <w:jc w:val="left"/>
+            </w:pPr>
+            <w:r/>
+            <w:r>
+              <w:rPr>
+                <w:rFonts w:ascii="Aptos" w:hAnsi="Aptos"/>
+                <w:b w:val="0"/>
+                <w:color w:val="000000"/>
+                <w:sz w:val="19"/>
+              </w:rPr>
+              <w:t>Team Leader</w:t>
+            </w:r>
+          </w:p>
+        </w:tc>
+        <w:tc>
+          <w:tcPr>
+            <w:tcW w:type="dxa" w:w="7560"/>
+            <w:vAlign w:val="center"/>
+            <w:tcMar>
+              <w:top w:w="100" w:type="dxa"/>
+              <w:start w:w="110" w:type="dxa"/>
+              <w:bottom w:w="100" w:type="dxa"/>
+              <w:end w:w="110" w:type="dxa"/>
+            </w:tcMar>
+            <w:shd w:fill="F8FAFC"/>
+          </w:tcPr>
+          <w:p>
+            <w:pPr>
+              <w:jc w:val="left"/>
+            </w:pPr>
+            <w:r/>
+            <w:r>
+              <w:rPr>
+                <w:rFonts w:ascii="Aptos" w:hAnsi="Aptos"/>
+                <w:b w:val="0"/>
+                <w:color w:val="000000"/>
+                <w:sz w:val="19"/>
+              </w:rPr>
+              <w:t>Parthiban M (NM ID: 28538B1DB05060E8D804CDAA88169909, Reg: 222401226)</w:t>
+            </w:r>
+          </w:p>
+        </w:tc>
+      </w:tr>
+      <w:tr>
+        <w:trPr>
+          <w:cantSplit/>
+        </w:trPr>
+        <w:tc>
+          <w:tcPr>
+            <w:tcW w:type="dxa" w:w="2232"/>
+            <w:vAlign w:val="center"/>
+            <w:tcMar>
+              <w:top w:w="100" w:type="dxa"/>
+              <w:start w:w="110" w:type="dxa"/>
+              <w:bottom w:w="100" w:type="dxa"/>
+              <w:end w:w="110" w:type="dxa"/>
+            </w:tcMar>
+          </w:tcPr>
+          <w:p>
+            <w:pPr>
+              <w:jc w:val="left"/>
+            </w:pPr>
+            <w:r/>
+            <w:r>
+              <w:rPr>
+                <w:rFonts w:ascii="Aptos" w:hAnsi="Aptos"/>
+                <w:b w:val="0"/>
+                <w:color w:val="000000"/>
+                <w:sz w:val="19"/>
+              </w:rPr>
+              <w:t>Team Members</w:t>
+            </w:r>
+          </w:p>
+        </w:tc>
+        <w:tc>
+          <w:tcPr>
+            <w:tcW w:type="dxa" w:w="7560"/>
+            <w:vAlign w:val="center"/>
+            <w:tcMar>
+              <w:top w:w="100" w:type="dxa"/>
+              <w:start w:w="110" w:type="dxa"/>
+              <w:bottom w:w="100" w:type="dxa"/>
+              <w:end w:w="110" w:type="dxa"/>
+            </w:tcMar>
+          </w:tcPr>
+          <w:p>
+            <w:pPr>
+              <w:jc w:val="left"/>
+            </w:pPr>
+            <w:r/>
+            <w:r>
+              <w:rPr>
+                <w:rFonts w:ascii="Aptos" w:hAnsi="Aptos"/>
+                <w:b w:val="0"/>
+                <w:color w:val="000000"/>
+                <w:sz w:val="19"/>
+              </w:rPr>
+              <w:t>Naveen J (NM ID: 53C2DC1753C6DFDAF8649841B4630C80, Reg: 222401223); Nidesh N S (NM ID: FDE55A8DA9135F6AB7347C01AD1B8A17, Reg: 222401224); Nithish Kumar P (NM ID: BFBD9AD8CEC72229F374877DB82CC0B8, Reg: 222401225)</w:t>
+            </w:r>
+          </w:p>
+        </w:tc>
+      </w:tr>
+      <w:tr>
+        <w:trPr>
+          <w:cantSplit/>
+        </w:trPr>
+        <w:tc>
+          <w:tcPr>
+            <w:tcW w:type="dxa" w:w="2232"/>
+            <w:vAlign w:val="center"/>
+            <w:tcMar>
+              <w:top w:w="100" w:type="dxa"/>
+              <w:start w:w="110" w:type="dxa"/>
+              <w:bottom w:w="100" w:type="dxa"/>
+              <w:end w:w="110" w:type="dxa"/>
+            </w:tcMar>
+            <w:shd w:fill="F8FAFC"/>
+          </w:tcPr>
+          <w:p>
+            <w:pPr>
+              <w:jc w:val="left"/>
+            </w:pPr>
+            <w:r/>
+            <w:r>
+              <w:rPr>
+                <w:rFonts w:ascii="Aptos" w:hAnsi="Aptos"/>
+                <w:b w:val="0"/>
+                <w:color w:val="000000"/>
+                <w:sz w:val="19"/>
+              </w:rPr>
+              <w:t>Project scope</w:t>
+            </w:r>
+          </w:p>
+        </w:tc>
+        <w:tc>
+          <w:tcPr>
+            <w:tcW w:type="dxa" w:w="7560"/>
+            <w:vAlign w:val="center"/>
+            <w:tcMar>
+              <w:top w:w="100" w:type="dxa"/>
+              <w:start w:w="110" w:type="dxa"/>
+              <w:bottom w:w="100" w:type="dxa"/>
+              <w:end w:w="110" w:type="dxa"/>
+            </w:tcMar>
+            <w:shd w:fill="F8FAFC"/>
+          </w:tcPr>
+          <w:p>
+            <w:pPr>
+              <w:jc w:val="left"/>
+            </w:pPr>
+            <w:r/>
+            <w:r>
+              <w:rPr>
+                <w:rFonts w:ascii="Aptos" w:hAnsi="Aptos"/>
+                <w:b w:val="0"/>
+                <w:color w:val="000000"/>
+                <w:sz w:val="19"/>
+              </w:rPr>
+              <w:t>Backend-only REST API</w:t>
+            </w:r>
+          </w:p>
+        </w:tc>
+      </w:tr>
+      <w:tr>
+        <w:trPr>
+          <w:cantSplit/>
+        </w:trPr>
+        <w:tc>
+          <w:tcPr>
+            <w:tcW w:type="dxa" w:w="2232"/>
+            <w:vAlign w:val="center"/>
+            <w:tcMar>
+              <w:top w:w="100" w:type="dxa"/>
+              <w:start w:w="110" w:type="dxa"/>
+              <w:bottom w:w="100" w:type="dxa"/>
+              <w:end w:w="110" w:type="dxa"/>
+            </w:tcMar>
+          </w:tcPr>
+          <w:p>
+            <w:pPr>
+              <w:jc w:val="left"/>
+            </w:pPr>
+            <w:r/>
+            <w:r>
+              <w:rPr>
+                <w:rFonts w:ascii="Aptos" w:hAnsi="Aptos"/>
+                <w:b w:val="0"/>
+                <w:color w:val="000000"/>
+                <w:sz w:val="19"/>
+              </w:rPr>
+              <w:t>Technology</w:t>
+            </w:r>
+          </w:p>
+        </w:tc>
+        <w:tc>
+          <w:tcPr>
+            <w:tcW w:type="dxa" w:w="7560"/>
+            <w:vAlign w:val="center"/>
+            <w:tcMar>
+              <w:top w:w="100" w:type="dxa"/>
+              <w:start w:w="110" w:type="dxa"/>
+              <w:bottom w:w="100" w:type="dxa"/>
+              <w:end w:w="110" w:type="dxa"/>
+            </w:tcMar>
+          </w:tcPr>
+          <w:p>
+            <w:pPr>
+              <w:jc w:val="left"/>
+            </w:pPr>
+            <w:r/>
+            <w:r>
+              <w:rPr>
+                <w:rFonts w:ascii="Aptos" w:hAnsi="Aptos"/>
+                <w:b w:val="0"/>
+                <w:color w:val="000000"/>
+                <w:sz w:val="19"/>
+              </w:rPr>
+              <w:t>Node.js, Express.js, MongoDB, Mongoose, JWT and Google Gemini AI</w:t>
+            </w:r>
+          </w:p>
+        </w:tc>
+      </w:tr>
+      <w:tr>
+        <w:trPr>
+          <w:cantSplit/>
+        </w:trPr>
+        <w:tc>
+          <w:tcPr>
+            <w:tcW w:type="dxa" w:w="2232"/>
+            <w:vAlign w:val="center"/>
+            <w:tcMar>
+              <w:top w:w="100" w:type="dxa"/>
+              <w:start w:w="110" w:type="dxa"/>
+              <w:bottom w:w="100" w:type="dxa"/>
+              <w:end w:w="110" w:type="dxa"/>
+            </w:tcMar>
+            <w:shd w:fill="F8FAFC"/>
+          </w:tcPr>
+          <w:p>
+            <w:pPr>
+              <w:jc w:val="left"/>
+            </w:pPr>
+            <w:r/>
+            <w:r>
+              <w:rPr>
+                <w:rFonts w:ascii="Aptos" w:hAnsi="Aptos"/>
+                <w:b w:val="0"/>
+                <w:color w:val="000000"/>
+                <w:sz w:val="19"/>
+              </w:rPr>
+              <w:t>Source baseline</w:t>
+            </w:r>
+          </w:p>
+        </w:tc>
+        <w:tc>
+          <w:tcPr>
+            <w:tcW w:type="dxa" w:w="7560"/>
+            <w:vAlign w:val="center"/>
+            <w:tcMar>
+              <w:top w:w="100" w:type="dxa"/>
+              <w:start w:w="110" w:type="dxa"/>
+              <w:bottom w:w="100" w:type="dxa"/>
+              <w:end w:w="110" w:type="dxa"/>
+            </w:tcMar>
+            <w:shd w:fill="F8FAFC"/>
+          </w:tcPr>
+          <w:p>
+            <w:pPr>
+              <w:jc w:val="left"/>
+            </w:pPr>
+            <w:r/>
+            <w:r>
+              <w:rPr>
+                <w:rFonts w:ascii="Aptos" w:hAnsi="Aptos"/>
+                <w:b w:val="0"/>
                 <w:color w:val="000000"/>
                 <w:sz w:val="19"/>
               </w:rPr>
@@ -408,7 +970,6 @@
         <w:tc>
           <w:tcPr>
             <w:tcW w:type="dxa" w:w="2232"/>
-            <w:shd w:fill="F8FAFC"/>
             <w:vAlign w:val="center"/>
             <w:tcMar>
               <w:top w:w="100" w:type="dxa"/>
@@ -421,9 +982,11 @@
             <w:pPr>
               <w:jc w:val="left"/>
             </w:pPr>
+            <w:r/>
             <w:r>
               <w:rPr>
                 <w:rFonts w:ascii="Aptos" w:hAnsi="Aptos"/>
+                <w:b w:val="0"/>
                 <w:color w:val="000000"/>
                 <w:sz w:val="19"/>
               </w:rPr>
@@ -434,7 +997,6 @@
         <w:tc>
           <w:tcPr>
             <w:tcW w:type="dxa" w:w="7560"/>
-            <w:shd w:fill="F8FAFC"/>
             <w:vAlign w:val="center"/>
             <w:tcMar>
               <w:top w:w="100" w:type="dxa"/>
@@ -447,13 +1009,15 @@
             <w:pPr>
               <w:jc w:val="left"/>
             </w:pPr>
+            <w:r/>
             <w:r>
               <w:rPr>
                 <w:rFonts w:ascii="Aptos" w:hAnsi="Aptos"/>
+                <w:b w:val="0"/>
                 <w:color w:val="000000"/>
                 <w:sz w:val="19"/>
               </w:rPr>
-              <w:t>Submission-ready content; student metadata and final video links remain pending</w:t>
+              <w:t>Submission-ready verified technical documentation with complete academic details</w:t>
             </w:r>
           </w:p>
         </w:tc>
@@ -8161,13 +8725,7 @@
     </w:p>
     <w:p>
       <w:r>
-        <w:rPr>
-          <w:rFonts w:ascii="Aptos" w:hAnsi="Aptos"/>
-          <w:i w:val="0"/>
-          <w:color w:val="000000"/>
-          <w:sz w:val="22"/>
-        </w:rPr>
-        <w:t>AI FitTrack meets the official backend objectives with secure authentication, MongoDB workout management, search and Gemini-assisted guidance. The implementation and supplied evidence support the functional completion claim. Final submission readiness depends on adding official student metadata, publishing the repository, capturing synchronized final evidence and recording the demonstration video.</w:t>
+        <w:t>AI FitTrack meets the official backend objectives with secure authentication, MongoDB workout management, search and Gemini-assisted guidance. The implementation and supplied evidence support the functional completion claim. Team SWTID-2026-8100, its four members, faculty guide, and institution details are fully confirmed in this report. Final submission readiness includes publishing the repository, capturing synchronized final evidence, and recording the demonstration video.</w:t>
       </w:r>
     </w:p>
     <w:p>
@@ -8653,7 +9211,6 @@
         <w:tc>
           <w:tcPr>
             <w:tcW w:type="dxa" w:w="2376"/>
-            <w:shd w:fill="0F766E"/>
             <w:vAlign w:val="center"/>
             <w:tcMar>
               <w:top w:w="100" w:type="dxa"/>
@@ -8661,6 +9218,7 @@
               <w:bottom w:w="100" w:type="dxa"/>
               <w:end w:w="110" w:type="dxa"/>
             </w:tcMar>
+            <w:shd w:fill="16324F"/>
           </w:tcPr>
           <w:p>
             <w:pPr>
@@ -8680,7 +9238,6 @@
         <w:tc>
           <w:tcPr>
             <w:tcW w:type="dxa" w:w="7416"/>
-            <w:shd w:fill="0F766E"/>
             <w:vAlign w:val="center"/>
             <w:tcMar>
               <w:top w:w="100" w:type="dxa"/>
@@ -8688,6 +9245,7 @@
               <w:bottom w:w="100" w:type="dxa"/>
               <w:end w:w="110" w:type="dxa"/>
             </w:tcMar>
+            <w:shd w:fill="16324F"/>
           </w:tcPr>
           <w:p>
             <w:pPr>
@@ -8730,174 +9288,6 @@
                 <w:color w:val="000000"/>
                 <w:sz w:val="17"/>
               </w:rPr>
-              <w:t>Student identity</w:t>
-            </w:r>
-          </w:p>
-        </w:tc>
-        <w:tc>
-          <w:tcPr>
-            <w:tcW w:type="dxa" w:w="7416"/>
-            <w:vAlign w:val="center"/>
-            <w:tcMar>
-              <w:top w:w="100" w:type="dxa"/>
-              <w:start w:w="110" w:type="dxa"/>
-              <w:bottom w:w="100" w:type="dxa"/>
-              <w:end w:w="110" w:type="dxa"/>
-            </w:tcMar>
-          </w:tcPr>
-          <w:p>
-            <w:pPr>
-              <w:jc w:val="left"/>
-            </w:pPr>
-            <w:r>
-              <w:rPr>
-                <w:rFonts w:ascii="Aptos" w:hAnsi="Aptos"/>
-                <w:color w:val="000000"/>
-                <w:sz w:val="17"/>
-              </w:rPr>
-              <w:t>Name, NM ID, register or roll number and department were not present in the supplied project files.</w:t>
-            </w:r>
-          </w:p>
-        </w:tc>
-      </w:tr>
-      <w:tr>
-        <w:trPr>
-          <w:cantSplit/>
-        </w:trPr>
-        <w:tc>
-          <w:tcPr>
-            <w:tcW w:type="dxa" w:w="2376"/>
-            <w:shd w:fill="F8FAFC"/>
-            <w:vAlign w:val="center"/>
-            <w:tcMar>
-              <w:top w:w="100" w:type="dxa"/>
-              <w:start w:w="110" w:type="dxa"/>
-              <w:bottom w:w="100" w:type="dxa"/>
-              <w:end w:w="110" w:type="dxa"/>
-            </w:tcMar>
-          </w:tcPr>
-          <w:p>
-            <w:pPr>
-              <w:jc w:val="left"/>
-            </w:pPr>
-            <w:r>
-              <w:rPr>
-                <w:rFonts w:ascii="Aptos" w:hAnsi="Aptos"/>
-                <w:color w:val="000000"/>
-                <w:sz w:val="17"/>
-              </w:rPr>
-              <w:t>Institution details</w:t>
-            </w:r>
-          </w:p>
-        </w:tc>
-        <w:tc>
-          <w:tcPr>
-            <w:tcW w:type="dxa" w:w="7416"/>
-            <w:shd w:fill="F8FAFC"/>
-            <w:vAlign w:val="center"/>
-            <w:tcMar>
-              <w:top w:w="100" w:type="dxa"/>
-              <w:start w:w="110" w:type="dxa"/>
-              <w:bottom w:w="100" w:type="dxa"/>
-              <w:end w:w="110" w:type="dxa"/>
-            </w:tcMar>
-          </w:tcPr>
-          <w:p>
-            <w:pPr>
-              <w:jc w:val="left"/>
-            </w:pPr>
-            <w:r>
-              <w:rPr>
-                <w:rFonts w:ascii="Aptos" w:hAnsi="Aptos"/>
-                <w:color w:val="000000"/>
-                <w:sz w:val="17"/>
-              </w:rPr>
-              <w:t>College name, academic year, guide or mentor name and official submission date need confirmation.</w:t>
-            </w:r>
-          </w:p>
-        </w:tc>
-      </w:tr>
-      <w:tr>
-        <w:trPr>
-          <w:cantSplit/>
-        </w:trPr>
-        <w:tc>
-          <w:tcPr>
-            <w:tcW w:type="dxa" w:w="2376"/>
-            <w:vAlign w:val="center"/>
-            <w:tcMar>
-              <w:top w:w="100" w:type="dxa"/>
-              <w:start w:w="110" w:type="dxa"/>
-              <w:bottom w:w="100" w:type="dxa"/>
-              <w:end w:w="110" w:type="dxa"/>
-            </w:tcMar>
-          </w:tcPr>
-          <w:p>
-            <w:pPr>
-              <w:jc w:val="left"/>
-            </w:pPr>
-            <w:r>
-              <w:rPr>
-                <w:rFonts w:ascii="Aptos" w:hAnsi="Aptos"/>
-                <w:color w:val="000000"/>
-                <w:sz w:val="17"/>
-              </w:rPr>
-              <w:t>Team details</w:t>
-            </w:r>
-          </w:p>
-        </w:tc>
-        <w:tc>
-          <w:tcPr>
-            <w:tcW w:type="dxa" w:w="7416"/>
-            <w:vAlign w:val="center"/>
-            <w:tcMar>
-              <w:top w:w="100" w:type="dxa"/>
-              <w:start w:w="110" w:type="dxa"/>
-              <w:bottom w:w="100" w:type="dxa"/>
-              <w:end w:w="110" w:type="dxa"/>
-            </w:tcMar>
-          </w:tcPr>
-          <w:p>
-            <w:pPr>
-              <w:jc w:val="left"/>
-            </w:pPr>
-            <w:r>
-              <w:rPr>
-                <w:rFonts w:ascii="Aptos" w:hAnsi="Aptos"/>
-                <w:color w:val="000000"/>
-                <w:sz w:val="17"/>
-              </w:rPr>
-              <w:t>Team name, member list and responsibility allocation were not supplied; no ownership is assigned in these documents.</w:t>
-            </w:r>
-          </w:p>
-        </w:tc>
-      </w:tr>
-      <w:tr>
-        <w:trPr>
-          <w:cantSplit/>
-        </w:trPr>
-        <w:tc>
-          <w:tcPr>
-            <w:tcW w:type="dxa" w:w="2376"/>
-            <w:shd w:fill="F8FAFC"/>
-            <w:vAlign w:val="center"/>
-            <w:tcMar>
-              <w:top w:w="100" w:type="dxa"/>
-              <w:start w:w="110" w:type="dxa"/>
-              <w:bottom w:w="100" w:type="dxa"/>
-              <w:end w:w="110" w:type="dxa"/>
-            </w:tcMar>
-          </w:tcPr>
-          <w:p>
-            <w:pPr>
-              <w:jc w:val="left"/>
-            </w:pPr>
-            <w:r>
-              <w:rPr>
-                <w:rFonts w:ascii="Aptos" w:hAnsi="Aptos"/>
-                <w:color w:val="000000"/>
-                <w:sz w:val="17"/>
-              </w:rPr>
               <w:t>Repository</w:t>
             </w:r>
           </w:p>
@@ -8905,7 +9295,6 @@
         <w:tc>
           <w:tcPr>
             <w:tcW w:type="dxa" w:w="7416"/>
-            <w:shd w:fill="F8FAFC"/>
             <w:vAlign w:val="center"/>
             <w:tcMar>
               <w:top w:w="100" w:type="dxa"/>
@@ -8943,6 +9332,7 @@
               <w:bottom w:w="100" w:type="dxa"/>
               <w:end w:w="110" w:type="dxa"/>
             </w:tcMar>
+            <w:shd w:fill="F8FAFC"/>
           </w:tcPr>
           <w:p>
             <w:pPr>
@@ -8968,6 +9358,7 @@
               <w:bottom w:w="100" w:type="dxa"/>
               <w:end w:w="110" w:type="dxa"/>
             </w:tcMar>
+            <w:shd w:fill="F8FAFC"/>
           </w:tcPr>
           <w:p>
             <w:pPr>
@@ -8991,7 +9382,6 @@
         <w:tc>
           <w:tcPr>
             <w:tcW w:type="dxa" w:w="2376"/>
-            <w:shd w:fill="F8FAFC"/>
             <w:vAlign w:val="center"/>
             <w:tcMar>
               <w:top w:w="100" w:type="dxa"/>
@@ -9017,7 +9407,6 @@
         <w:tc>
           <w:tcPr>
             <w:tcW w:type="dxa" w:w="7416"/>
-            <w:shd w:fill="F8FAFC"/>
             <w:vAlign w:val="center"/>
             <w:tcMar>
               <w:top w:w="100" w:type="dxa"/>
@@ -9073,7 +9462,7 @@
         <w:color w:val="4D5561"/>
         <w:sz w:val="17"/>
       </w:rPr>
-      <w:t xml:space="preserve">AI FitTrack  |  Page </w:t>
+      <w:t xml:space="preserve">AI FitTrack  |  SWTID-2026-8100  |  Page </w:t>
     </w:r>
     <w:r>
       <w:fldChar w:fldCharType="begin"/>
@@ -9098,7 +9487,7 @@
         <w:color w:val="4D5561"/>
         <w:sz w:val="17"/>
       </w:rPr>
-      <w:t>AI FitTrack  |  SmartBridge Naan Mudhalvan</w:t>
+      <w:t>AI FitTrack  |  Team SWTID-2026-8100</w:t>
     </w:r>
   </w:p>
 </w:hdr>

</xml_diff>